<commit_message>
Add card media, private feedback, and shared DEV invitations
</commit_message>
<xml_diff>
--- a/docs/reference/TheDigitalCardBox Financial Summary.docx
+++ b/docs/reference/TheDigitalCardBox Financial Summary.docx
@@ -3429,6 +3429,19 @@
         <w:t xml:space="preserve">Existing feature stories own behavior; existing Security stories own encryption and tested database/media restore, published retention and a manual deletion runbook. Database design alone is not implementation or verified transaction history. Guest intake closure does not delete private CardVault records or promise indefinite hosting. Automated deletion and future checkout remain Post-MVP.</w:t>
       </w:r>
     </w:p>
+    <w:p>
+      <w:pPr>
+        <w:pStyle w:val="Heading2"/>
+      </w:pPr>
+      <w:r>
+        <w:t>21 October 2026 DEV review extension</w:t>
+      </w:r>
+    </w:p>
+    <w:p>
+      <w:r>
+        <w:t>The owner brought a bounded DEV AI artwork experiment forward on 21 October. Server limits allow two attempts per guest, ten per event, four per hashed IP and twenty globally each day. Each request fixes one low-quality portrait image; failures count and there are no automatic paid retries. A $0.02 per-attempt planning reserve yields $0.40/day estimated maximum at twenty attempts; provider input charges/pricing can vary, so this is not a guaranteed billing cap. Configure project budget alerts and monitor actual usage. No paid provider calls were made by automated tests. Production economics remain subject to review.</w:t>
+      </w:r>
+    </w:p>
     <w:sectPr>
       <w:footerReference w:type="default" r:id="rId9"/>
       <w:pgSz w:w="12240" w:h="15840"/>

</xml_diff>

<commit_message>
Expand free retained animations and save media with card exports
</commit_message>
<xml_diff>
--- a/docs/reference/TheDigitalCardBox Financial Summary.docx
+++ b/docs/reference/TheDigitalCardBox Financial Summary.docx
@@ -3442,6 +3442,19 @@
         <w:t>The owner brought a bounded DEV AI artwork experiment forward on 21 October. Server limits allow two attempts per guest, ten per event, four per hashed IP and twenty globally each day. Each request fixes one low-quality portrait image; failures count and there are no automatic paid retries. A $0.02 per-attempt planning reserve yields $0.40/day estimated maximum at twenty attempts; provider input charges/pricing can vary, so this is not a guaranteed billing cap. Configure project budget alerts and monitor actual usage. No paid provider calls were made by automated tests. Production economics remain subject to review.</w:t>
       </w:r>
     </w:p>
+    <w:p>
+      <w:pPr>
+        <w:pStyle w:val="Heading2"/>
+      </w:pPr>
+      <w:r>
+        <w:t>22 October 2026 freely licensed animations</w:t>
+      </w:r>
+    </w:p>
+    <w:p>
+      <w:r>
+        <w:t>The 22 October animation expansion introduces no GIF API, license subscription or custom provider fee. The 120 added Google Fonts Animated Noto Emoji assets use CC BY 4.0 with attribution and are stored on existing app hosting, with compact animations, lazy posters and paginated results. Ordinary hosting usage remains subject to the existing hosting plan. This is separate from optional, still-key-gated OpenAI card artwork and its previously documented request caps.</w:t>
+      </w:r>
+    </w:p>
     <w:sectPr>
       <w:footerReference w:type="default" r:id="rId9"/>
       <w:pgSz w:w="12240" w:h="15840"/>

</xml_diff>